<commit_message>
Add phase1 pipeline figures: 6 data-driven charts + updated report
- plot_phase1.py: generates 6 figures from real stats JSONs at 300 DPI
    fig_p1: full pipeline funnel waterfall (stages 1-6, with discard %s)
    fig_p2: stage 2 dialogue filter breakdown (7 filters, horizontal bar)
    fig_p3: stage 4 pair filter breakdown (7 filters, by severity colour)
    fig_p4: stage 4.5 domain filter — stacked bar + signal overlap donut
    fig_p5: token length distributions ctx+resp (train/val/test percentiles)
    fig_p6: temporal train/val/test split timeline (readable val/test bands)
- report/phase1_pipeline.md: 6 figure insertions at precise locations,
  ASCII art funnel (Appendix B) and ASCII timeline (Stage 3) replaced
- report/phase1_pipeline.docx: rebuilt with all figures embedded (1,089 KB)
- .gitignore: keep PNGs, exclude PDFs from figures/

Co-authored-by: Copilot <223556219+Copilot@users.noreply.github.com>
</commit_message>
<xml_diff>
--- a/report/phase1_pipeline.docx
+++ b/report/phase1_pipeline.docx
@@ -235,7 +235,67 @@
         <w:t>1,103,539 training pairs</w:t>
       </w:r>
       <w:r>
-        <w:t xml:space="preserve"> — a retention path of 59.6 % measured at the pair level. Every discarded item is counted, categorised, and written to the companion </w:t>
+        <w:t xml:space="preserve"> — a retention path of 59.6 % measured at the pair level.</w:t>
+      </w:r>
+    </w:p>
+    <w:p>
+      <w:pPr>
+        <w:jc w:val="center"/>
+      </w:pPr>
+      <w:r>
+        <w:drawing>
+          <wp:inline xmlns:a="http://schemas.openxmlformats.org/drawingml/2006/main" xmlns:pic="http://schemas.openxmlformats.org/drawingml/2006/picture">
+            <wp:extent cx="5029200" cy="2153562"/>
+            <wp:docPr id="1" name="Picture 1"/>
+            <wp:cNvGraphicFramePr>
+              <a:graphicFrameLocks noChangeAspect="1"/>
+            </wp:cNvGraphicFramePr>
+            <a:graphic>
+              <a:graphicData uri="http://schemas.openxmlformats.org/drawingml/2006/picture">
+                <pic:pic>
+                  <pic:nvPicPr>
+                    <pic:cNvPr id="0" name="fig_p1_funnel.png"/>
+                    <pic:cNvPicPr/>
+                  </pic:nvPicPr>
+                  <pic:blipFill>
+                    <a:blip r:embed="rId9"/>
+                    <a:stretch>
+                      <a:fillRect/>
+                    </a:stretch>
+                  </pic:blipFill>
+                  <pic:spPr>
+                    <a:xfrm>
+                      <a:off x="0" y="0"/>
+                      <a:ext cx="5029200" cy="2153562"/>
+                    </a:xfrm>
+                    <a:prstGeom prst="rect"/>
+                  </pic:spPr>
+                </pic:pic>
+              </a:graphicData>
+            </a:graphic>
+          </wp:inline>
+        </w:drawing>
+      </w:r>
+    </w:p>
+    <w:p>
+      <w:pPr>
+        <w:spacing w:before="40" w:after="200"/>
+        <w:jc w:val="center"/>
+      </w:pPr>
+      <w:r>
+        <w:rPr>
+          <w:i/>
+          <w:sz w:val="18"/>
+        </w:rPr>
+        <w:t>Figure P1 — Full data reduction funnel across all pipeline stages</w:t>
+      </w:r>
+    </w:p>
+    <w:p>
+      <w:pPr>
+        <w:spacing w:after="120"/>
+      </w:pPr>
+      <w:r>
+        <w:t xml:space="preserve">*Figure P1: Each bar represents the record count at the output of that stage. Blue = dialogue records; orange = context-response pairs; green = final GPU-ready dataset. Discard counts and percentages are shown inside each bar.* Every discarded item is counted, categorised, and written to the companion </w:t>
       </w:r>
       <w:r>
         <w:rPr>
@@ -2355,128 +2415,62 @@
     </w:p>
     <w:p>
       <w:pPr>
-        <w:pBdr>
-          <w:bottom w:val="single" w:sz="6" w:space="1" w:color="AAAAAA"/>
-        </w:pBdr>
+        <w:jc w:val="center"/>
       </w:pPr>
+      <w:r>
+        <w:drawing>
+          <wp:inline xmlns:a="http://schemas.openxmlformats.org/drawingml/2006/main" xmlns:pic="http://schemas.openxmlformats.org/drawingml/2006/picture">
+            <wp:extent cx="5029200" cy="2768039"/>
+            <wp:docPr id="2" name="Picture 2"/>
+            <wp:cNvGraphicFramePr>
+              <a:graphicFrameLocks noChangeAspect="1"/>
+            </wp:cNvGraphicFramePr>
+            <a:graphic>
+              <a:graphicData uri="http://schemas.openxmlformats.org/drawingml/2006/picture">
+                <pic:pic>
+                  <pic:nvPicPr>
+                    <pic:cNvPr id="0" name="fig_p2_stage2_filters.png"/>
+                    <pic:cNvPicPr/>
+                  </pic:nvPicPr>
+                  <pic:blipFill>
+                    <a:blip r:embed="rId10"/>
+                    <a:stretch>
+                      <a:fillRect/>
+                    </a:stretch>
+                  </pic:blipFill>
+                  <pic:spPr>
+                    <a:xfrm>
+                      <a:off x="0" y="0"/>
+                      <a:ext cx="5029200" cy="2768039"/>
+                    </a:xfrm>
+                    <a:prstGeom prst="rect"/>
+                  </pic:spPr>
+                </pic:pic>
+              </a:graphicData>
+            </a:graphic>
+          </wp:inline>
+        </w:drawing>
+      </w:r>
     </w:p>
     <w:p>
       <w:pPr>
-        <w:pStyle w:val="Heading3"/>
-        <w:spacing w:before="200"/>
+        <w:spacing w:before="40" w:after="200"/>
+        <w:jc w:val="center"/>
       </w:pPr>
       <w:r>
-        <w:t>A.3 Stage 3 — Temporal Split</w:t>
+        <w:rPr>
+          <w:i/>
+          <w:sz w:val="18"/>
+        </w:rPr>
+        <w:t>Figure P2 — Stage 2 dialogue filter breakdown by filter type</w:t>
       </w:r>
     </w:p>
     <w:p>
       <w:pPr>
         <w:spacing w:after="120"/>
       </w:pPr>
-      <w:r/>
-      <w:r>
-        <w:rPr>
-          <w:b/>
-        </w:rPr>
-        <w:t>Function:</w:t>
-      </w:r>
-      <w:r>
-        <w:t xml:space="preserve"> </w:t>
-      </w:r>
-      <w:r>
-        <w:rPr>
-          <w:rFonts w:ascii="Courier New" w:hAnsi="Courier New"/>
-          <w:sz w:val="20"/>
-        </w:rPr>
-        <w:t>stage3_temporal_split(dialogues, cfg)</w:t>
-      </w:r>
-      <w:r/>
-    </w:p>
-    <w:p>
-      <w:pPr>
-        <w:spacing w:after="120"/>
-      </w:pPr>
-      <w:r/>
-      <w:r>
-        <w:rPr>
-          <w:b/>
-        </w:rPr>
-        <w:t>Output:</w:t>
-      </w:r>
-      <w:r>
-        <w:t xml:space="preserve"> </w:t>
-      </w:r>
-      <w:r>
-        <w:rPr>
-          <w:rFonts w:ascii="Courier New" w:hAnsi="Courier New"/>
-          <w:sz w:val="20"/>
-        </w:rPr>
-        <w:t>stage3_{train,val,test}.pkl</w:t>
-      </w:r>
-      <w:r>
-        <w:t xml:space="preserve">, </w:t>
-      </w:r>
-      <w:r>
-        <w:rPr>
-          <w:rFonts w:ascii="Courier New" w:hAnsi="Courier New"/>
-          <w:sz w:val="20"/>
-        </w:rPr>
-        <w:t>stage3_stats.json</w:t>
-      </w:r>
-      <w:r/>
-    </w:p>
-    <w:p>
-      <w:pPr>
-        <w:spacing w:after="120"/>
-      </w:pPr>
-      <w:r>
-        <w:t xml:space="preserve">Dialogues are assigned to splits by their </w:t>
-      </w:r>
-      <w:r>
-        <w:rPr>
-          <w:b/>
-        </w:rPr>
-        <w:t>first-turn UTC date</w:t>
-      </w:r>
-      <w:r>
-        <w:t>. No dialogue spans two splits, guaranteeing zero thread-level leakage. Overlap assertions are hard-coded and fail-fast.</w:t>
-      </w:r>
-    </w:p>
-    <w:p>
-      <w:pPr>
-        <w:spacing w:before="80" w:after="80"/>
-        <w:ind w:left="432"/>
-        <w:shd w:val="clear" w:color="auto" w:fill="F2F2F2"/>
-      </w:pPr>
-      <w:r>
-        <w:rPr>
-          <w:rFonts w:ascii="Courier New" w:hAnsi="Courier New"/>
-          <w:sz w:val="18"/>
-        </w:rPr>
-        <w:t>Timeline ─────────────────────────────────────────────────────►</w:t>
-        <w:br/>
-        <w:t xml:space="preserve">  2004          2012-04-27      2012-08-07</w:t>
-        <w:br/>
-        <w:t xml:space="preserve">  │←─── TRAIN ──────────►│←─VAL─►│←── TEST ──►│</w:t>
-        <w:br/>
-        <w:t xml:space="preserve">  │   1,259,711 dialogues │ 27,550 │ 27,847     │</w:t>
-        <w:br/>
-        <w:t xml:space="preserve">  │        95.8%          │  2.1%  │   2.1%     │</w:t>
-      </w:r>
-    </w:p>
-    <w:p>
-      <w:pPr>
-        <w:spacing w:after="120"/>
-      </w:pPr>
-      <w:r/>
-      <w:r>
-        <w:rPr>
-          <w:b/>
-        </w:rPr>
-        <w:t>Why temporal, not random?</w:t>
-      </w:r>
-      <w:r>
-        <w:t xml:space="preserve"> A random split would allow the model to train on conversations from the same week as validation examples, inflating val metrics and failing to simulate real deployment (always predicting on future text). The temporal split enforces true generalisation over time.</w:t>
+      <w:r>
+        <w:t>*Figure P2: Contribution of each Stage 2 filter to the 537,760 discarded dialogues. Speaker dominance (43.7%) and temporal hard ceiling (32.7%) together account for three-quarters of all discards.*</w:t>
       </w:r>
     </w:p>
     <w:p>
@@ -2492,7 +2486,7 @@
         <w:spacing w:before="200"/>
       </w:pPr>
       <w:r>
-        <w:t>A.4 Stage 4 — Generate Context-Response Pairs</w:t>
+        <w:t>A.3 Stage 3 — Temporal Split</w:t>
       </w:r>
     </w:p>
     <w:p>
@@ -2514,7 +2508,7 @@
           <w:rFonts w:ascii="Courier New" w:hAnsi="Courier New"/>
           <w:sz w:val="20"/>
         </w:rPr>
-        <w:t>stage4_generate_pairs(train_dlg, val_dlg, test_dlg, cfg)</w:t>
+        <w:t>stage3_temporal_split(dialogues, cfg)</w:t>
       </w:r>
       <w:r/>
     </w:p>
@@ -2537,7 +2531,7 @@
           <w:rFonts w:ascii="Courier New" w:hAnsi="Courier New"/>
           <w:sz w:val="20"/>
         </w:rPr>
-        <w:t>stage4_*_pairs.json</w:t>
+        <w:t>stage3_{train,val,test}.pkl</w:t>
       </w:r>
       <w:r>
         <w:t xml:space="preserve">, </w:t>
@@ -2547,17 +2541,7 @@
           <w:rFonts w:ascii="Courier New" w:hAnsi="Courier New"/>
           <w:sz w:val="20"/>
         </w:rPr>
-        <w:t>stage4_*_samples.txt</w:t>
-      </w:r>
-      <w:r>
-        <w:t xml:space="preserve">, </w:t>
-      </w:r>
-      <w:r>
-        <w:rPr>
-          <w:rFonts w:ascii="Courier New" w:hAnsi="Courier New"/>
-          <w:sz w:val="20"/>
-        </w:rPr>
-        <w:t>stage4_stats.json</w:t>
+        <w:t>stage3_stats.json</w:t>
       </w:r>
       <w:r/>
     </w:p>
@@ -2566,130 +2550,16 @@
         <w:spacing w:after="120"/>
       </w:pPr>
       <w:r>
-        <w:t>For each dialogue, consecutive same-speaker turns are first merged (</w:t>
+        <w:t xml:space="preserve">Dialogues are assigned to splits by their </w:t>
       </w:r>
       <w:r>
         <w:rPr>
-          <w:rFonts w:ascii="Courier New" w:hAnsi="Courier New"/>
-          <w:sz w:val="20"/>
+          <w:b/>
         </w:rPr>
-        <w:t>_merge_same_speaker_turns</w:t>
-      </w:r>
-      <w:r>
-        <w:t xml:space="preserve">). Then for each turn </w:t>
-      </w:r>
-      <w:r>
-        <w:rPr>
-          <w:rFonts w:ascii="Courier New" w:hAnsi="Courier New"/>
-          <w:sz w:val="20"/>
-        </w:rPr>
-        <w:t>i</w:t>
-      </w:r>
-      <w:r>
-        <w:t xml:space="preserve"> designated as the response, the preceding </w:t>
-      </w:r>
-      <w:r>
-        <w:rPr>
-          <w:rFonts w:ascii="Courier New" w:hAnsi="Courier New"/>
-          <w:sz w:val="20"/>
-        </w:rPr>
-        <w:t>max_ctx_turns=8</w:t>
-      </w:r>
-      <w:r>
-        <w:t xml:space="preserve"> turns are concatenated with </w:t>
-      </w:r>
-      <w:r>
-        <w:rPr>
-          <w:rFonts w:ascii="Courier New" w:hAnsi="Courier New"/>
-          <w:sz w:val="20"/>
-        </w:rPr>
-        <w:t>__eot__</w:t>
-      </w:r>
-      <w:r>
-        <w:t xml:space="preserve"> separators to form the context:</w:t>
-      </w:r>
-    </w:p>
-    <w:p>
-      <w:pPr>
-        <w:spacing w:before="80" w:after="80"/>
-        <w:ind w:left="432"/>
-        <w:shd w:val="clear" w:color="auto" w:fill="F2F2F2"/>
-      </w:pPr>
-      <w:r>
-        <w:rPr>
-          <w:rFonts w:ascii="Courier New" w:hAnsi="Courier New"/>
-          <w:sz w:val="18"/>
-        </w:rPr>
-        <w:t>turn_{i-k} __eot__ ... __eot__ turn_{i-2} __eot__ turn_{i-1}   →  ctx</w:t>
-        <w:br/>
-        <w:t>turn_i                                                           →  resp</w:t>
-      </w:r>
-    </w:p>
-    <w:p>
-      <w:pPr>
-        <w:spacing w:after="120"/>
-      </w:pPr>
-      <w:r>
-        <w:t xml:space="preserve">IRC speaker handles matching </w:t>
-      </w:r>
-      <w:r>
-        <w:rPr>
-          <w:rFonts w:ascii="Courier New" w:hAnsi="Courier New"/>
-          <w:sz w:val="20"/>
-        </w:rPr>
-        <w:t>[\d_\-\[\]\\^{}|]</w:t>
-      </w:r>
-      <w:r>
-        <w:t xml:space="preserve"> or length &gt; 9 are replaced with </w:t>
-      </w:r>
-      <w:r>
-        <w:rPr>
-          <w:rFonts w:ascii="Courier New" w:hAnsi="Courier New"/>
-          <w:sz w:val="20"/>
-        </w:rPr>
-        <w:t>__user__</w:t>
-      </w:r>
-      <w:r>
-        <w:t xml:space="preserve">. The 11 known IRC bot names (including possessive forms like </w:t>
-      </w:r>
-      <w:r>
-        <w:rPr>
-          <w:rFonts w:ascii="Courier New" w:hAnsi="Courier New"/>
-          <w:sz w:val="20"/>
-        </w:rPr>
-        <w:t>ubottu's</w:t>
-      </w:r>
-      <w:r>
-        <w:t xml:space="preserve">) are also replaced with </w:t>
-      </w:r>
-      <w:r>
-        <w:rPr>
-          <w:rFonts w:ascii="Courier New" w:hAnsi="Courier New"/>
-          <w:sz w:val="20"/>
-        </w:rPr>
-        <w:t>__user__</w:t>
-      </w:r>
-      <w:r>
-        <w:t xml:space="preserve"> via </w:t>
-      </w:r>
-      <w:r>
-        <w:rPr>
-          <w:rFonts w:ascii="Courier New" w:hAnsi="Courier New"/>
-          <w:sz w:val="20"/>
-        </w:rPr>
-        <w:t>_RE_BOT_NAMES</w:t>
-      </w:r>
-      <w:r>
-        <w:t>.</w:t>
-      </w:r>
-    </w:p>
-    <w:p>
-      <w:pPr>
-        <w:pStyle w:val="Heading4"/>
-        <w:spacing w:before="200"/>
-      </w:pPr>
-      <w:r>
-        <w:t>Pair-level filters applied to every generated pair</w:t>
+        <w:t>first-turn UTC date</w:t>
+      </w:r>
+      <w:r>
+        <w:t>. No dialogue spans two splits, guaranteeing zero thread-level leakage. Overlap assertions are hard-coded and fail-fast.</w:t>
       </w:r>
     </w:p>
     <w:tbl>
@@ -2718,7 +2588,7 @@
               <w:rPr>
                 <w:b/>
               </w:rPr>
-              <w:t>Filter</w:t>
+              <w:t>Split</w:t>
             </w:r>
           </w:p>
         </w:tc>
@@ -2735,7 +2605,7 @@
               <w:rPr>
                 <w:b/>
               </w:rPr>
-              <w:t>Rule</w:t>
+              <w:t>Date range</w:t>
             </w:r>
           </w:p>
         </w:tc>
@@ -2752,7 +2622,7 @@
               <w:rPr>
                 <w:b/>
               </w:rPr>
-              <w:t>Discards (train)</w:t>
+              <w:t>Dialogues</w:t>
             </w:r>
           </w:p>
         </w:tc>
@@ -2769,7 +2639,7 @@
               <w:rPr>
                 <w:b/>
               </w:rPr>
-              <w:t>% of raw</w:t>
+              <w:t>%</w:t>
             </w:r>
           </w:p>
         </w:tc>
@@ -2785,7 +2655,7 @@
             </w:pPr>
             <w:r/>
             <w:r>
-              <w:t>Min response length</w:t>
+              <w:t>Train</w:t>
             </w:r>
           </w:p>
         </w:tc>
@@ -2798,16 +2668,8 @@
               <w:spacing w:before="40" w:after="40"/>
             </w:pPr>
             <w:r/>
-            <w:r/>
-            <w:r>
-              <w:rPr>
-                <w:rFonts w:ascii="Courier New" w:hAnsi="Courier New"/>
-                <w:sz w:val="20"/>
-              </w:rPr>
-              <w:t>min_resp_tokens=5</w:t>
-            </w:r>
-            <w:r>
-              <w:t xml:space="preserve"> (word-level)</w:t>
+            <w:r>
+              <w:t>2004 – 2012-04-27</w:t>
             </w:r>
           </w:p>
         </w:tc>
@@ -2821,7 +2683,7 @@
             </w:pPr>
             <w:r/>
             <w:r>
-              <w:t>971,906</w:t>
+              <w:t>1,259,711</w:t>
             </w:r>
           </w:p>
         </w:tc>
@@ -2835,7 +2697,7 @@
             </w:pPr>
             <w:r/>
             <w:r>
-              <w:t>27.6%</w:t>
+              <w:t>95.8%</w:t>
             </w:r>
           </w:p>
         </w:tc>
@@ -2851,17 +2713,7 @@
             </w:pPr>
             <w:r/>
             <w:r>
-              <w:t>Coherence (</w:t>
-            </w:r>
-            <w:r>
-              <w:rPr>
-                <w:rFonts w:ascii="Courier New" w:hAnsi="Courier New"/>
-                <w:sz w:val="20"/>
-              </w:rPr>
-              <w:t>filter_incoherent_pairs</w:t>
-            </w:r>
-            <w:r>
-              <w:t>)</w:t>
+              <w:t>Val</w:t>
             </w:r>
           </w:p>
         </w:tc>
@@ -2875,7 +2727,7 @@
             </w:pPr>
             <w:r/>
             <w:r>
-              <w:t>Last substantive ctx turn AND resp share ≥ 5 content words (non-stopwords, ≥ 4 chars)</w:t>
+              <w:t>2012-04-27 – 2012-08-07</w:t>
             </w:r>
           </w:p>
         </w:tc>
@@ -2889,7 +2741,7 @@
             </w:pPr>
             <w:r/>
             <w:r>
-              <w:t>748,826</w:t>
+              <w:t>27,550</w:t>
             </w:r>
           </w:p>
         </w:tc>
@@ -2903,7 +2755,7 @@
             </w:pPr>
             <w:r/>
             <w:r>
-              <w:t>21.2%</w:t>
+              <w:t>2.1%</w:t>
             </w:r>
           </w:p>
         </w:tc>
@@ -2919,7 +2771,7 @@
             </w:pPr>
             <w:r/>
             <w:r>
-              <w:t>Max response length</w:t>
+              <w:t>Test</w:t>
             </w:r>
           </w:p>
         </w:tc>
@@ -2932,15 +2784,9 @@
               <w:spacing w:before="40" w:after="40"/>
             </w:pPr>
             <w:r/>
-            <w:r/>
-            <w:r>
-              <w:rPr>
-                <w:rFonts w:ascii="Courier New" w:hAnsi="Courier New"/>
-                <w:sz w:val="20"/>
-              </w:rPr>
-              <w:t>max_resp_tokens=40</w:t>
-            </w:r>
-            <w:r/>
+            <w:r>
+              <w:t>2012-08-07 onwards</w:t>
+            </w:r>
           </w:p>
         </w:tc>
         <w:tc>
@@ -2953,7 +2799,7 @@
             </w:pPr>
             <w:r/>
             <w:r>
-              <w:t>255,579</w:t>
+              <w:t>27,847</w:t>
             </w:r>
           </w:p>
         </w:tc>
@@ -2967,325 +2813,7 @@
             </w:pPr>
             <w:r/>
             <w:r>
-              <w:t>7.3%</w:t>
-            </w:r>
-          </w:p>
-        </w:tc>
-      </w:tr>
-      <w:tr>
-        <w:tc>
-          <w:tcPr>
-            <w:tcW w:type="dxa" w:w="2280"/>
-          </w:tcPr>
-          <w:p>
-            <w:pPr>
-              <w:spacing w:before="40" w:after="40"/>
-            </w:pPr>
-            <w:r/>
-            <w:r>
-              <w:t>Bot response blacklist</w:t>
-            </w:r>
-          </w:p>
-        </w:tc>
-        <w:tc>
-          <w:tcPr>
-            <w:tcW w:type="dxa" w:w="2280"/>
-          </w:tcPr>
-          <w:p>
-            <w:pPr>
-              <w:spacing w:before="40" w:after="40"/>
-            </w:pPr>
-            <w:r/>
-            <w:r>
-              <w:t>28 regex patterns (scripted/moderation responses)</w:t>
-            </w:r>
-          </w:p>
-        </w:tc>
-        <w:tc>
-          <w:tcPr>
-            <w:tcW w:type="dxa" w:w="2280"/>
-          </w:tcPr>
-          <w:p>
-            <w:pPr>
-              <w:spacing w:before="40" w:after="40"/>
-            </w:pPr>
-            <w:r/>
-            <w:r>
-              <w:t>—</w:t>
-            </w:r>
-          </w:p>
-        </w:tc>
-        <w:tc>
-          <w:tcPr>
-            <w:tcW w:type="dxa" w:w="2280"/>
-          </w:tcPr>
-          <w:p>
-            <w:pPr>
-              <w:spacing w:before="40" w:after="40"/>
-            </w:pPr>
-            <w:r/>
-            <w:r>
-              <w:t>—</w:t>
-            </w:r>
-          </w:p>
-        </w:tc>
-      </w:tr>
-      <w:tr>
-        <w:tc>
-          <w:tcPr>
-            <w:tcW w:type="dxa" w:w="2280"/>
-          </w:tcPr>
-          <w:p>
-            <w:pPr>
-              <w:spacing w:before="40" w:after="40"/>
-            </w:pPr>
-            <w:r/>
-            <w:r>
-              <w:t>Echo pairs</w:t>
-            </w:r>
-          </w:p>
-        </w:tc>
-        <w:tc>
-          <w:tcPr>
-            <w:tcW w:type="dxa" w:w="2280"/>
-          </w:tcPr>
-          <w:p>
-            <w:pPr>
-              <w:spacing w:before="40" w:after="40"/>
-            </w:pPr>
-            <w:r/>
-            <w:r>
-              <w:t>Response verbatim in context</w:t>
-            </w:r>
-          </w:p>
-        </w:tc>
-        <w:tc>
-          <w:tcPr>
-            <w:tcW w:type="dxa" w:w="2280"/>
-          </w:tcPr>
-          <w:p>
-            <w:pPr>
-              <w:spacing w:before="40" w:after="40"/>
-            </w:pPr>
-            <w:r/>
-            <w:r>
-              <w:t>—</w:t>
-            </w:r>
-          </w:p>
-        </w:tc>
-        <w:tc>
-          <w:tcPr>
-            <w:tcW w:type="dxa" w:w="2280"/>
-          </w:tcPr>
-          <w:p>
-            <w:pPr>
-              <w:spacing w:before="40" w:after="40"/>
-            </w:pPr>
-            <w:r/>
-            <w:r>
-              <w:t>—</w:t>
-            </w:r>
-          </w:p>
-        </w:tc>
-      </w:tr>
-      <w:tr>
-        <w:tc>
-          <w:tcPr>
-            <w:tcW w:type="dxa" w:w="2280"/>
-          </w:tcPr>
-          <w:p>
-            <w:pPr>
-              <w:spacing w:before="40" w:after="40"/>
-            </w:pPr>
-            <w:r/>
-            <w:r>
-              <w:t>Placeholder-only</w:t>
-            </w:r>
-          </w:p>
-        </w:tc>
-        <w:tc>
-          <w:tcPr>
-            <w:tcW w:type="dxa" w:w="2280"/>
-          </w:tcPr>
-          <w:p>
-            <w:pPr>
-              <w:spacing w:before="40" w:after="40"/>
-            </w:pPr>
-            <w:r/>
-            <w:r>
-              <w:t xml:space="preserve">Response is only </w:t>
-            </w:r>
-            <w:r>
-              <w:rPr>
-                <w:rFonts w:ascii="Courier New" w:hAnsi="Courier New"/>
-                <w:sz w:val="20"/>
-              </w:rPr>
-              <w:t>__url__</w:t>
-            </w:r>
-            <w:r>
-              <w:t>/</w:t>
-            </w:r>
-            <w:r>
-              <w:rPr>
-                <w:rFonts w:ascii="Courier New" w:hAnsi="Courier New"/>
-                <w:sz w:val="20"/>
-              </w:rPr>
-              <w:t>__path__</w:t>
-            </w:r>
-            <w:r>
-              <w:t>/</w:t>
-            </w:r>
-            <w:r>
-              <w:rPr>
-                <w:rFonts w:ascii="Courier New" w:hAnsi="Courier New"/>
-                <w:sz w:val="20"/>
-              </w:rPr>
-              <w:t>__ip__</w:t>
-            </w:r>
-            <w:r/>
-          </w:p>
-        </w:tc>
-        <w:tc>
-          <w:tcPr>
-            <w:tcW w:type="dxa" w:w="2280"/>
-          </w:tcPr>
-          <w:p>
-            <w:pPr>
-              <w:spacing w:before="40" w:after="40"/>
-            </w:pPr>
-            <w:r/>
-            <w:r>
-              <w:t>—</w:t>
-            </w:r>
-          </w:p>
-        </w:tc>
-        <w:tc>
-          <w:tcPr>
-            <w:tcW w:type="dxa" w:w="2280"/>
-          </w:tcPr>
-          <w:p>
-            <w:pPr>
-              <w:spacing w:before="40" w:after="40"/>
-            </w:pPr>
-            <w:r/>
-            <w:r>
-              <w:t>—</w:t>
-            </w:r>
-          </w:p>
-        </w:tc>
-      </w:tr>
-      <w:tr>
-        <w:tc>
-          <w:tcPr>
-            <w:tcW w:type="dxa" w:w="2280"/>
-          </w:tcPr>
-          <w:p>
-            <w:pPr>
-              <w:spacing w:before="40" w:after="40"/>
-            </w:pPr>
-            <w:r/>
-            <w:r>
-              <w:t>Non-English</w:t>
-            </w:r>
-          </w:p>
-        </w:tc>
-        <w:tc>
-          <w:tcPr>
-            <w:tcW w:type="dxa" w:w="2280"/>
-          </w:tcPr>
-          <w:p>
-            <w:pPr>
-              <w:spacing w:before="40" w:after="40"/>
-            </w:pPr>
-            <w:r/>
-            <w:r>
-              <w:t>Response ASCII ratio &lt; 80%</w:t>
-            </w:r>
-          </w:p>
-        </w:tc>
-        <w:tc>
-          <w:tcPr>
-            <w:tcW w:type="dxa" w:w="2280"/>
-          </w:tcPr>
-          <w:p>
-            <w:pPr>
-              <w:spacing w:before="40" w:after="40"/>
-            </w:pPr>
-            <w:r/>
-            <w:r>
-              <w:t>—</w:t>
-            </w:r>
-          </w:p>
-        </w:tc>
-        <w:tc>
-          <w:tcPr>
-            <w:tcW w:type="dxa" w:w="2280"/>
-          </w:tcPr>
-          <w:p>
-            <w:pPr>
-              <w:spacing w:before="40" w:after="40"/>
-            </w:pPr>
-            <w:r/>
-            <w:r>
-              <w:t>—</w:t>
-            </w:r>
-          </w:p>
-        </w:tc>
-      </w:tr>
-      <w:tr>
-        <w:tc>
-          <w:tcPr>
-            <w:tcW w:type="dxa" w:w="2280"/>
-          </w:tcPr>
-          <w:p>
-            <w:pPr>
-              <w:spacing w:before="40" w:after="40"/>
-            </w:pPr>
-            <w:r/>
-            <w:r>
-              <w:t>Diversity cap</w:t>
-            </w:r>
-          </w:p>
-        </w:tc>
-        <w:tc>
-          <w:tcPr>
-            <w:tcW w:type="dxa" w:w="2280"/>
-          </w:tcPr>
-          <w:p>
-            <w:pPr>
-              <w:spacing w:before="40" w:after="40"/>
-            </w:pPr>
-            <w:r/>
-            <w:r>
-              <w:t>Same response text seen &gt; 500× (train only)</w:t>
-            </w:r>
-          </w:p>
-        </w:tc>
-        <w:tc>
-          <w:tcPr>
-            <w:tcW w:type="dxa" w:w="2280"/>
-          </w:tcPr>
-          <w:p>
-            <w:pPr>
-              <w:spacing w:before="40" w:after="40"/>
-            </w:pPr>
-            <w:r/>
-            <w:r>
-              <w:t>1,730</w:t>
-            </w:r>
-          </w:p>
-        </w:tc>
-        <w:tc>
-          <w:tcPr>
-            <w:tcW w:type="dxa" w:w="2280"/>
-          </w:tcPr>
-          <w:p>
-            <w:pPr>
-              <w:spacing w:before="40" w:after="40"/>
-            </w:pPr>
-            <w:r/>
-            <w:r>
-              <w:t>0.05%</w:t>
+              <w:t>2.1%</w:t>
             </w:r>
           </w:p>
         </w:tc>
@@ -3296,28 +2824,75 @@
       <w:pPr>
         <w:spacing w:after="120"/>
       </w:pPr>
-      <w:r>
-        <w:t xml:space="preserve">After filtering, train pairs are randomly shuffled and capped at </w:t>
-      </w:r>
+      <w:r/>
       <w:r>
         <w:rPr>
-          <w:rFonts w:ascii="Courier New" w:hAnsi="Courier New"/>
-          <w:sz w:val="20"/>
+          <w:b/>
         </w:rPr>
-        <w:t>max_train_pairs=1,500,000</w:t>
-      </w:r>
-      <w:r>
-        <w:t xml:space="preserve">. A sample of 200 pairs is written to </w:t>
-      </w:r>
+        <w:t>Why temporal, not random?</w:t>
+      </w:r>
+      <w:r>
+        <w:t xml:space="preserve"> A random split would allow the model to train on conversations from the same week as validation examples, inflating val metrics and failing to simulate real deployment (always predicting on future text). The temporal split enforces true generalisation over time.</w:t>
+      </w:r>
+    </w:p>
+    <w:p>
+      <w:pPr>
+        <w:jc w:val="center"/>
+      </w:pPr>
+      <w:r>
+        <w:drawing>
+          <wp:inline xmlns:a="http://schemas.openxmlformats.org/drawingml/2006/main" xmlns:pic="http://schemas.openxmlformats.org/drawingml/2006/picture">
+            <wp:extent cx="5029200" cy="1614881"/>
+            <wp:docPr id="3" name="Picture 3"/>
+            <wp:cNvGraphicFramePr>
+              <a:graphicFrameLocks noChangeAspect="1"/>
+            </wp:cNvGraphicFramePr>
+            <a:graphic>
+              <a:graphicData uri="http://schemas.openxmlformats.org/drawingml/2006/picture">
+                <pic:pic>
+                  <pic:nvPicPr>
+                    <pic:cNvPr id="0" name="fig_p6_temporal_split.png"/>
+                    <pic:cNvPicPr/>
+                  </pic:nvPicPr>
+                  <pic:blipFill>
+                    <a:blip r:embed="rId11"/>
+                    <a:stretch>
+                      <a:fillRect/>
+                    </a:stretch>
+                  </pic:blipFill>
+                  <pic:spPr>
+                    <a:xfrm>
+                      <a:off x="0" y="0"/>
+                      <a:ext cx="5029200" cy="1614881"/>
+                    </a:xfrm>
+                    <a:prstGeom prst="rect"/>
+                  </pic:spPr>
+                </pic:pic>
+              </a:graphicData>
+            </a:graphic>
+          </wp:inline>
+        </w:drawing>
+      </w:r>
+    </w:p>
+    <w:p>
+      <w:pPr>
+        <w:spacing w:before="40" w:after="200"/>
+        <w:jc w:val="center"/>
+      </w:pPr>
       <w:r>
         <w:rPr>
-          <w:rFonts w:ascii="Courier New" w:hAnsi="Courier New"/>
-          <w:sz w:val="20"/>
+          <w:i/>
+          <w:sz w:val="18"/>
         </w:rPr>
-        <w:t>stage4_train_samples.txt</w:t>
-      </w:r>
-      <w:r>
-        <w:t xml:space="preserve"> for manual inspection.</w:t>
+        <w:t>Figure P6 — Temporal train / val / test split timeline</w:t>
+      </w:r>
+    </w:p>
+    <w:p>
+      <w:pPr>
+        <w:spacing w:after="120"/>
+      </w:pPr>
+      <w:r>
+        <w:t>*Figure P6: Val/test bands are enlarged for legibility (not to scale). Zero thread-level overlap was confirmed programmatically — no dialogue ID appears in more than one split.*</w:t>
       </w:r>
     </w:p>
     <w:p>
@@ -3333,7 +2908,7 @@
         <w:spacing w:before="200"/>
       </w:pPr>
       <w:r>
-        <w:t>A.5 Stage 4.5 — Domain Filter</w:t>
+        <w:t>A.4 Stage 4 — Generate Context-Response Pairs</w:t>
       </w:r>
     </w:p>
     <w:p>
@@ -3355,7 +2930,7 @@
           <w:rFonts w:ascii="Courier New" w:hAnsi="Courier New"/>
           <w:sz w:val="20"/>
         </w:rPr>
-        <w:t>stage4_5_domain_filter(train_pairs, val_pairs, test_pairs, cfg)</w:t>
+        <w:t>stage4_generate_pairs(train_dlg, val_dlg, test_dlg, cfg)</w:t>
       </w:r>
       <w:r/>
     </w:p>
@@ -3368,7 +2943,7 @@
         <w:rPr>
           <w:b/>
         </w:rPr>
-        <w:t>Config:</w:t>
+        <w:t>Output:</w:t>
       </w:r>
       <w:r>
         <w:t xml:space="preserve"> </w:t>
@@ -3378,7 +2953,7 @@
           <w:rFonts w:ascii="Courier New" w:hAnsi="Courier New"/>
           <w:sz w:val="20"/>
         </w:rPr>
-        <w:t>domain_filter=True</w:t>
+        <w:t>stage4_*_pairs.json</w:t>
       </w:r>
       <w:r>
         <w:t xml:space="preserve">, </w:t>
@@ -3388,7 +2963,17 @@
           <w:rFonts w:ascii="Courier New" w:hAnsi="Courier New"/>
           <w:sz w:val="20"/>
         </w:rPr>
-        <w:t>domain_filter_strategy="union"</w:t>
+        <w:t>stage4_*_samples.txt</w:t>
+      </w:r>
+      <w:r>
+        <w:t xml:space="preserve">, </w:t>
+      </w:r>
+      <w:r>
+        <w:rPr>
+          <w:rFonts w:ascii="Courier New" w:hAnsi="Courier New"/>
+          <w:sz w:val="20"/>
+        </w:rPr>
+        <w:t>stage4_stats.json</w:t>
       </w:r>
       <w:r/>
     </w:p>
@@ -3396,68 +2981,48 @@
       <w:pPr>
         <w:spacing w:after="120"/>
       </w:pPr>
-      <w:r/>
-      <w:r>
-        <w:rPr>
-          <w:b/>
-        </w:rPr>
-        <w:t>Output:</w:t>
-      </w:r>
-      <w:r>
-        <w:t xml:space="preserve"> </w:t>
+      <w:r>
+        <w:t>For each dialogue, consecutive same-speaker turns are first merged (</w:t>
       </w:r>
       <w:r>
         <w:rPr>
           <w:rFonts w:ascii="Courier New" w:hAnsi="Courier New"/>
           <w:sz w:val="20"/>
         </w:rPr>
-        <w:t>stage4_5_*_pairs.json</w:t>
-      </w:r>
-      <w:r>
-        <w:t xml:space="preserve">, </w:t>
+        <w:t>_merge_same_speaker_turns</w:t>
+      </w:r>
+      <w:r>
+        <w:t xml:space="preserve">). Then for each turn </w:t>
       </w:r>
       <w:r>
         <w:rPr>
           <w:rFonts w:ascii="Courier New" w:hAnsi="Courier New"/>
           <w:sz w:val="20"/>
         </w:rPr>
-        <w:t>stage4_5_filter_stats.json</w:t>
-      </w:r>
-      <w:r/>
-    </w:p>
-    <w:p>
-      <w:pPr>
-        <w:spacing w:after="120"/>
-      </w:pPr>
-      <w:r>
-        <w:t xml:space="preserve">Retains pairs matching </w:t>
+        <w:t>i</w:t>
+      </w:r>
+      <w:r>
+        <w:t xml:space="preserve"> designated as the response, the preceding </w:t>
       </w:r>
       <w:r>
         <w:rPr>
-          <w:b/>
+          <w:rFonts w:ascii="Courier New" w:hAnsi="Courier New"/>
+          <w:sz w:val="20"/>
         </w:rPr>
-        <w:t>Strategy A</w:t>
-      </w:r>
-      <w:r>
-        <w:t xml:space="preserve"> (command/path signal) OR </w:t>
+        <w:t>max_ctx_turns=8</w:t>
+      </w:r>
+      <w:r>
+        <w:t xml:space="preserve"> turns are concatenated with </w:t>
       </w:r>
       <w:r>
         <w:rPr>
-          <w:b/>
+          <w:rFonts w:ascii="Courier New" w:hAnsi="Courier New"/>
+          <w:sz w:val="20"/>
         </w:rPr>
-        <w:t>Strategy B</w:t>
-      </w:r>
-      <w:r>
-        <w:t xml:space="preserve"> (question pattern). The union avoids the over-restrictive intersection (~300k) while still removing chit-chat noise.</w:t>
-      </w:r>
-    </w:p>
-    <w:p>
-      <w:pPr>
-        <w:pStyle w:val="Heading4"/>
-        <w:spacing w:before="200"/>
-      </w:pPr>
-      <w:r>
-        <w:t>Strategy A — Command filter (`_DOMAIN_CMD_RE`)</w:t>
+        <w:t>__eot__</w:t>
+      </w:r>
+      <w:r>
+        <w:t xml:space="preserve"> separators to form the context:</w:t>
       </w:r>
     </w:p>
     <w:p>
@@ -3471,13 +3036,9 @@
           <w:rFonts w:ascii="Courier New" w:hAnsi="Courier New"/>
           <w:sz w:val="18"/>
         </w:rPr>
-        <w:t>\b(sudo|apt-get|apt|dpkg|snap|chmod|chown|grep|cat|ls|mkdir|rm|cp|mv|</w:t>
+        <w:t>turn_{i-k} __eot__ ... __eot__ turn_{i-2} __eot__ turn_{i-1}   →  ctx</w:t>
         <w:br/>
-        <w:t xml:space="preserve">   wget|curl|tar|ssh|df|du|kill|mount|umount|pip|nano|vim|vi|sed|awk|</w:t>
-        <w:br/>
-        <w:t xml:space="preserve">   find|locate|ps|top|ping|service|systemctl|ufw|crontab|adduser|passwd|</w:t>
-        <w:br/>
-        <w:t xml:space="preserve">   netstat|ifconfig|export|echo|source|make|gcc)\b</w:t>
+        <w:t>turn_i                                                           →  resp</w:t>
       </w:r>
     </w:p>
     <w:p>
@@ -3485,74 +3046,57 @@
         <w:spacing w:after="120"/>
       </w:pPr>
       <w:r>
-        <w:t xml:space="preserve">OR </w:t>
+        <w:t xml:space="preserve">IRC speaker handles matching </w:t>
       </w:r>
       <w:r>
         <w:rPr>
           <w:rFonts w:ascii="Courier New" w:hAnsi="Courier New"/>
           <w:sz w:val="20"/>
         </w:rPr>
-        <w:t>"__path__"</w:t>
-      </w:r>
-      <w:r>
-        <w:t xml:space="preserve"> present in ctx or resp (already-masked filesystem references).</w:t>
-      </w:r>
-    </w:p>
-    <w:p>
-      <w:pPr>
-        <w:spacing w:after="120"/>
-      </w:pPr>
-      <w:r>
-        <w:t xml:space="preserve">&gt; </w:t>
-      </w:r>
-      <w:r>
-        <w:rPr>
-          <w:b/>
-        </w:rPr>
-        <w:t>Critical design note:</w:t>
-      </w:r>
-      <w:r>
-        <w:t xml:space="preserve"> </w:t>
+        <w:t>[\d_\-\[\]\\^{}|]</w:t>
+      </w:r>
+      <w:r>
+        <w:t xml:space="preserve"> or length &gt; 9 are replaced with </w:t>
       </w:r>
       <w:r>
         <w:rPr>
           <w:rFonts w:ascii="Courier New" w:hAnsi="Courier New"/>
           <w:sz w:val="20"/>
         </w:rPr>
-        <w:t>?</w:t>
-      </w:r>
-      <w:r>
-        <w:t xml:space="preserve"> is stripped by </w:t>
+        <w:t>__user__</w:t>
+      </w:r>
+      <w:r>
+        <w:t xml:space="preserve">. The 11 known IRC bot names (including possessive forms like </w:t>
       </w:r>
       <w:r>
         <w:rPr>
           <w:rFonts w:ascii="Courier New" w:hAnsi="Courier New"/>
           <w:sz w:val="20"/>
         </w:rPr>
-        <w:t>_RE_NONALPHA</w:t>
-      </w:r>
-      <w:r>
-        <w:t xml:space="preserve"> in Stage 2. All question-pattern matching must therefore be punctuation-free. Commands are NOT replaced by </w:t>
+        <w:t>ubottu's</w:t>
+      </w:r>
+      <w:r>
+        <w:t xml:space="preserve">) are also replaced with </w:t>
       </w:r>
       <w:r>
         <w:rPr>
           <w:rFonts w:ascii="Courier New" w:hAnsi="Courier New"/>
           <w:sz w:val="20"/>
         </w:rPr>
-        <w:t>__cmd__</w:t>
-      </w:r>
-      <w:r>
-        <w:t xml:space="preserve"> (the token is reserved but never substituted) — they survive </w:t>
+        <w:t>__user__</w:t>
+      </w:r>
+      <w:r>
+        <w:t xml:space="preserve"> via </w:t>
       </w:r>
       <w:r>
         <w:rPr>
           <w:rFonts w:ascii="Courier New" w:hAnsi="Courier New"/>
           <w:sz w:val="20"/>
         </w:rPr>
-        <w:t>_clean_text</w:t>
-      </w:r>
-      <w:r>
-        <w:t xml:space="preserve"> intact.</w:t>
+        <w:t>_RE_BOT_NAMES</w:t>
+      </w:r>
+      <w:r>
+        <w:t>.</w:t>
       </w:r>
     </w:p>
     <w:p>
@@ -3561,55 +3105,7 @@
         <w:spacing w:before="200"/>
       </w:pPr>
       <w:r>
-        <w:t>Strategy B — Question filter (`_DOMAIN_Q_PATTERNS`, last substantive context turn)</w:t>
-      </w:r>
-    </w:p>
-    <w:p>
-      <w:pPr>
-        <w:spacing w:before="80" w:after="80"/>
-        <w:ind w:left="432"/>
-        <w:shd w:val="clear" w:color="auto" w:fill="F2F2F2"/>
-      </w:pPr>
-      <w:r>
-        <w:rPr>
-          <w:rFonts w:ascii="Courier New" w:hAnsi="Courier New"/>
-          <w:sz w:val="18"/>
-        </w:rPr>
-        <w:t>how (do|can|to) (i|you|we)    what (is|are|does|do)</w:t>
-        <w:br/>
-        <w:t>where (is|are|can|do)          why (is|does|do)</w:t>
-        <w:br/>
-        <w:t>cannot                         problem|error|fail|broken|issue|not working</w:t>
-        <w:br/>
-        <w:t>i (need|want|am trying) to     anyone|anybody know</w:t>
-        <w:br/>
-        <w:t>is (is|can|do|will|does)\b</w:t>
-      </w:r>
-    </w:p>
-    <w:p>
-      <w:pPr>
-        <w:spacing w:after="120"/>
-      </w:pPr>
-      <w:r>
-        <w:t xml:space="preserve">Only the </w:t>
-      </w:r>
-      <w:r>
-        <w:rPr>
-          <w:b/>
-        </w:rPr>
-        <w:t>last 1–2 substantive turns</w:t>
-      </w:r>
-      <w:r>
-        <w:t xml:space="preserve"> (≥ 4 words) of the context are scanned — scanning all turns would match questions asked several exchanges ago, pairing them with off-topic recent replies.</w:t>
-      </w:r>
-    </w:p>
-    <w:p>
-      <w:pPr>
-        <w:pStyle w:val="Heading4"/>
-        <w:spacing w:before="200"/>
-      </w:pPr>
-      <w:r>
-        <w:t>Results</w:t>
+        <w:t>Pair-level filters applied to every generated pair</w:t>
       </w:r>
     </w:p>
     <w:tbl>
@@ -3638,6 +3134,986 @@
               <w:rPr>
                 <w:b/>
               </w:rPr>
+              <w:t>Filter</w:t>
+            </w:r>
+          </w:p>
+        </w:tc>
+        <w:tc>
+          <w:tcPr>
+            <w:tcW w:type="dxa" w:w="2280"/>
+          </w:tcPr>
+          <w:p>
+            <w:pPr>
+              <w:spacing w:before="40" w:after="40"/>
+            </w:pPr>
+            <w:r/>
+            <w:r>
+              <w:rPr>
+                <w:b/>
+              </w:rPr>
+              <w:t>Rule</w:t>
+            </w:r>
+          </w:p>
+        </w:tc>
+        <w:tc>
+          <w:tcPr>
+            <w:tcW w:type="dxa" w:w="2280"/>
+          </w:tcPr>
+          <w:p>
+            <w:pPr>
+              <w:spacing w:before="40" w:after="40"/>
+            </w:pPr>
+            <w:r/>
+            <w:r>
+              <w:rPr>
+                <w:b/>
+              </w:rPr>
+              <w:t>Discards (train)</w:t>
+            </w:r>
+          </w:p>
+        </w:tc>
+        <w:tc>
+          <w:tcPr>
+            <w:tcW w:type="dxa" w:w="2280"/>
+          </w:tcPr>
+          <w:p>
+            <w:pPr>
+              <w:spacing w:before="40" w:after="40"/>
+            </w:pPr>
+            <w:r/>
+            <w:r>
+              <w:rPr>
+                <w:b/>
+              </w:rPr>
+              <w:t>% of raw</w:t>
+            </w:r>
+          </w:p>
+        </w:tc>
+      </w:tr>
+      <w:tr>
+        <w:tc>
+          <w:tcPr>
+            <w:tcW w:type="dxa" w:w="2280"/>
+          </w:tcPr>
+          <w:p>
+            <w:pPr>
+              <w:spacing w:before="40" w:after="40"/>
+            </w:pPr>
+            <w:r/>
+            <w:r>
+              <w:t>Min response length</w:t>
+            </w:r>
+          </w:p>
+        </w:tc>
+        <w:tc>
+          <w:tcPr>
+            <w:tcW w:type="dxa" w:w="2280"/>
+          </w:tcPr>
+          <w:p>
+            <w:pPr>
+              <w:spacing w:before="40" w:after="40"/>
+            </w:pPr>
+            <w:r/>
+            <w:r/>
+            <w:r>
+              <w:rPr>
+                <w:rFonts w:ascii="Courier New" w:hAnsi="Courier New"/>
+                <w:sz w:val="20"/>
+              </w:rPr>
+              <w:t>min_resp_tokens=5</w:t>
+            </w:r>
+            <w:r>
+              <w:t xml:space="preserve"> (word-level)</w:t>
+            </w:r>
+          </w:p>
+        </w:tc>
+        <w:tc>
+          <w:tcPr>
+            <w:tcW w:type="dxa" w:w="2280"/>
+          </w:tcPr>
+          <w:p>
+            <w:pPr>
+              <w:spacing w:before="40" w:after="40"/>
+            </w:pPr>
+            <w:r/>
+            <w:r>
+              <w:t>971,906</w:t>
+            </w:r>
+          </w:p>
+        </w:tc>
+        <w:tc>
+          <w:tcPr>
+            <w:tcW w:type="dxa" w:w="2280"/>
+          </w:tcPr>
+          <w:p>
+            <w:pPr>
+              <w:spacing w:before="40" w:after="40"/>
+            </w:pPr>
+            <w:r/>
+            <w:r>
+              <w:t>27.6%</w:t>
+            </w:r>
+          </w:p>
+        </w:tc>
+      </w:tr>
+      <w:tr>
+        <w:tc>
+          <w:tcPr>
+            <w:tcW w:type="dxa" w:w="2280"/>
+          </w:tcPr>
+          <w:p>
+            <w:pPr>
+              <w:spacing w:before="40" w:after="40"/>
+            </w:pPr>
+            <w:r/>
+            <w:r>
+              <w:t>Coherence (</w:t>
+            </w:r>
+            <w:r>
+              <w:rPr>
+                <w:rFonts w:ascii="Courier New" w:hAnsi="Courier New"/>
+                <w:sz w:val="20"/>
+              </w:rPr>
+              <w:t>filter_incoherent_pairs</w:t>
+            </w:r>
+            <w:r>
+              <w:t>)</w:t>
+            </w:r>
+          </w:p>
+        </w:tc>
+        <w:tc>
+          <w:tcPr>
+            <w:tcW w:type="dxa" w:w="2280"/>
+          </w:tcPr>
+          <w:p>
+            <w:pPr>
+              <w:spacing w:before="40" w:after="40"/>
+            </w:pPr>
+            <w:r/>
+            <w:r>
+              <w:t>Last substantive ctx turn AND resp share ≥ 5 content words (non-stopwords, ≥ 4 chars)</w:t>
+            </w:r>
+          </w:p>
+        </w:tc>
+        <w:tc>
+          <w:tcPr>
+            <w:tcW w:type="dxa" w:w="2280"/>
+          </w:tcPr>
+          <w:p>
+            <w:pPr>
+              <w:spacing w:before="40" w:after="40"/>
+            </w:pPr>
+            <w:r/>
+            <w:r>
+              <w:t>748,826</w:t>
+            </w:r>
+          </w:p>
+        </w:tc>
+        <w:tc>
+          <w:tcPr>
+            <w:tcW w:type="dxa" w:w="2280"/>
+          </w:tcPr>
+          <w:p>
+            <w:pPr>
+              <w:spacing w:before="40" w:after="40"/>
+            </w:pPr>
+            <w:r/>
+            <w:r>
+              <w:t>21.2%</w:t>
+            </w:r>
+          </w:p>
+        </w:tc>
+      </w:tr>
+      <w:tr>
+        <w:tc>
+          <w:tcPr>
+            <w:tcW w:type="dxa" w:w="2280"/>
+          </w:tcPr>
+          <w:p>
+            <w:pPr>
+              <w:spacing w:before="40" w:after="40"/>
+            </w:pPr>
+            <w:r/>
+            <w:r>
+              <w:t>Max response length</w:t>
+            </w:r>
+          </w:p>
+        </w:tc>
+        <w:tc>
+          <w:tcPr>
+            <w:tcW w:type="dxa" w:w="2280"/>
+          </w:tcPr>
+          <w:p>
+            <w:pPr>
+              <w:spacing w:before="40" w:after="40"/>
+            </w:pPr>
+            <w:r/>
+            <w:r/>
+            <w:r>
+              <w:rPr>
+                <w:rFonts w:ascii="Courier New" w:hAnsi="Courier New"/>
+                <w:sz w:val="20"/>
+              </w:rPr>
+              <w:t>max_resp_tokens=40</w:t>
+            </w:r>
+            <w:r/>
+          </w:p>
+        </w:tc>
+        <w:tc>
+          <w:tcPr>
+            <w:tcW w:type="dxa" w:w="2280"/>
+          </w:tcPr>
+          <w:p>
+            <w:pPr>
+              <w:spacing w:before="40" w:after="40"/>
+            </w:pPr>
+            <w:r/>
+            <w:r>
+              <w:t>255,579</w:t>
+            </w:r>
+          </w:p>
+        </w:tc>
+        <w:tc>
+          <w:tcPr>
+            <w:tcW w:type="dxa" w:w="2280"/>
+          </w:tcPr>
+          <w:p>
+            <w:pPr>
+              <w:spacing w:before="40" w:after="40"/>
+            </w:pPr>
+            <w:r/>
+            <w:r>
+              <w:t>7.3%</w:t>
+            </w:r>
+          </w:p>
+        </w:tc>
+      </w:tr>
+      <w:tr>
+        <w:tc>
+          <w:tcPr>
+            <w:tcW w:type="dxa" w:w="2280"/>
+          </w:tcPr>
+          <w:p>
+            <w:pPr>
+              <w:spacing w:before="40" w:after="40"/>
+            </w:pPr>
+            <w:r/>
+            <w:r>
+              <w:t>Bot response blacklist</w:t>
+            </w:r>
+          </w:p>
+        </w:tc>
+        <w:tc>
+          <w:tcPr>
+            <w:tcW w:type="dxa" w:w="2280"/>
+          </w:tcPr>
+          <w:p>
+            <w:pPr>
+              <w:spacing w:before="40" w:after="40"/>
+            </w:pPr>
+            <w:r/>
+            <w:r>
+              <w:t>28 regex patterns (scripted/moderation responses)</w:t>
+            </w:r>
+          </w:p>
+        </w:tc>
+        <w:tc>
+          <w:tcPr>
+            <w:tcW w:type="dxa" w:w="2280"/>
+          </w:tcPr>
+          <w:p>
+            <w:pPr>
+              <w:spacing w:before="40" w:after="40"/>
+            </w:pPr>
+            <w:r/>
+            <w:r>
+              <w:t>—</w:t>
+            </w:r>
+          </w:p>
+        </w:tc>
+        <w:tc>
+          <w:tcPr>
+            <w:tcW w:type="dxa" w:w="2280"/>
+          </w:tcPr>
+          <w:p>
+            <w:pPr>
+              <w:spacing w:before="40" w:after="40"/>
+            </w:pPr>
+            <w:r/>
+            <w:r>
+              <w:t>—</w:t>
+            </w:r>
+          </w:p>
+        </w:tc>
+      </w:tr>
+      <w:tr>
+        <w:tc>
+          <w:tcPr>
+            <w:tcW w:type="dxa" w:w="2280"/>
+          </w:tcPr>
+          <w:p>
+            <w:pPr>
+              <w:spacing w:before="40" w:after="40"/>
+            </w:pPr>
+            <w:r/>
+            <w:r>
+              <w:t>Echo pairs</w:t>
+            </w:r>
+          </w:p>
+        </w:tc>
+        <w:tc>
+          <w:tcPr>
+            <w:tcW w:type="dxa" w:w="2280"/>
+          </w:tcPr>
+          <w:p>
+            <w:pPr>
+              <w:spacing w:before="40" w:after="40"/>
+            </w:pPr>
+            <w:r/>
+            <w:r>
+              <w:t>Response verbatim in context</w:t>
+            </w:r>
+          </w:p>
+        </w:tc>
+        <w:tc>
+          <w:tcPr>
+            <w:tcW w:type="dxa" w:w="2280"/>
+          </w:tcPr>
+          <w:p>
+            <w:pPr>
+              <w:spacing w:before="40" w:after="40"/>
+            </w:pPr>
+            <w:r/>
+            <w:r>
+              <w:t>—</w:t>
+            </w:r>
+          </w:p>
+        </w:tc>
+        <w:tc>
+          <w:tcPr>
+            <w:tcW w:type="dxa" w:w="2280"/>
+          </w:tcPr>
+          <w:p>
+            <w:pPr>
+              <w:spacing w:before="40" w:after="40"/>
+            </w:pPr>
+            <w:r/>
+            <w:r>
+              <w:t>—</w:t>
+            </w:r>
+          </w:p>
+        </w:tc>
+      </w:tr>
+      <w:tr>
+        <w:tc>
+          <w:tcPr>
+            <w:tcW w:type="dxa" w:w="2280"/>
+          </w:tcPr>
+          <w:p>
+            <w:pPr>
+              <w:spacing w:before="40" w:after="40"/>
+            </w:pPr>
+            <w:r/>
+            <w:r>
+              <w:t>Placeholder-only</w:t>
+            </w:r>
+          </w:p>
+        </w:tc>
+        <w:tc>
+          <w:tcPr>
+            <w:tcW w:type="dxa" w:w="2280"/>
+          </w:tcPr>
+          <w:p>
+            <w:pPr>
+              <w:spacing w:before="40" w:after="40"/>
+            </w:pPr>
+            <w:r/>
+            <w:r>
+              <w:t xml:space="preserve">Response is only </w:t>
+            </w:r>
+            <w:r>
+              <w:rPr>
+                <w:rFonts w:ascii="Courier New" w:hAnsi="Courier New"/>
+                <w:sz w:val="20"/>
+              </w:rPr>
+              <w:t>__url__</w:t>
+            </w:r>
+            <w:r>
+              <w:t>/</w:t>
+            </w:r>
+            <w:r>
+              <w:rPr>
+                <w:rFonts w:ascii="Courier New" w:hAnsi="Courier New"/>
+                <w:sz w:val="20"/>
+              </w:rPr>
+              <w:t>__path__</w:t>
+            </w:r>
+            <w:r>
+              <w:t>/</w:t>
+            </w:r>
+            <w:r>
+              <w:rPr>
+                <w:rFonts w:ascii="Courier New" w:hAnsi="Courier New"/>
+                <w:sz w:val="20"/>
+              </w:rPr>
+              <w:t>__ip__</w:t>
+            </w:r>
+            <w:r/>
+          </w:p>
+        </w:tc>
+        <w:tc>
+          <w:tcPr>
+            <w:tcW w:type="dxa" w:w="2280"/>
+          </w:tcPr>
+          <w:p>
+            <w:pPr>
+              <w:spacing w:before="40" w:after="40"/>
+            </w:pPr>
+            <w:r/>
+            <w:r>
+              <w:t>—</w:t>
+            </w:r>
+          </w:p>
+        </w:tc>
+        <w:tc>
+          <w:tcPr>
+            <w:tcW w:type="dxa" w:w="2280"/>
+          </w:tcPr>
+          <w:p>
+            <w:pPr>
+              <w:spacing w:before="40" w:after="40"/>
+            </w:pPr>
+            <w:r/>
+            <w:r>
+              <w:t>—</w:t>
+            </w:r>
+          </w:p>
+        </w:tc>
+      </w:tr>
+      <w:tr>
+        <w:tc>
+          <w:tcPr>
+            <w:tcW w:type="dxa" w:w="2280"/>
+          </w:tcPr>
+          <w:p>
+            <w:pPr>
+              <w:spacing w:before="40" w:after="40"/>
+            </w:pPr>
+            <w:r/>
+            <w:r>
+              <w:t>Non-English</w:t>
+            </w:r>
+          </w:p>
+        </w:tc>
+        <w:tc>
+          <w:tcPr>
+            <w:tcW w:type="dxa" w:w="2280"/>
+          </w:tcPr>
+          <w:p>
+            <w:pPr>
+              <w:spacing w:before="40" w:after="40"/>
+            </w:pPr>
+            <w:r/>
+            <w:r>
+              <w:t>Response ASCII ratio &lt; 80%</w:t>
+            </w:r>
+          </w:p>
+        </w:tc>
+        <w:tc>
+          <w:tcPr>
+            <w:tcW w:type="dxa" w:w="2280"/>
+          </w:tcPr>
+          <w:p>
+            <w:pPr>
+              <w:spacing w:before="40" w:after="40"/>
+            </w:pPr>
+            <w:r/>
+            <w:r>
+              <w:t>—</w:t>
+            </w:r>
+          </w:p>
+        </w:tc>
+        <w:tc>
+          <w:tcPr>
+            <w:tcW w:type="dxa" w:w="2280"/>
+          </w:tcPr>
+          <w:p>
+            <w:pPr>
+              <w:spacing w:before="40" w:after="40"/>
+            </w:pPr>
+            <w:r/>
+            <w:r>
+              <w:t>—</w:t>
+            </w:r>
+          </w:p>
+        </w:tc>
+      </w:tr>
+      <w:tr>
+        <w:tc>
+          <w:tcPr>
+            <w:tcW w:type="dxa" w:w="2280"/>
+          </w:tcPr>
+          <w:p>
+            <w:pPr>
+              <w:spacing w:before="40" w:after="40"/>
+            </w:pPr>
+            <w:r/>
+            <w:r>
+              <w:t>Diversity cap</w:t>
+            </w:r>
+          </w:p>
+        </w:tc>
+        <w:tc>
+          <w:tcPr>
+            <w:tcW w:type="dxa" w:w="2280"/>
+          </w:tcPr>
+          <w:p>
+            <w:pPr>
+              <w:spacing w:before="40" w:after="40"/>
+            </w:pPr>
+            <w:r/>
+            <w:r>
+              <w:t>Same response text seen &gt; 500× (train only)</w:t>
+            </w:r>
+          </w:p>
+        </w:tc>
+        <w:tc>
+          <w:tcPr>
+            <w:tcW w:type="dxa" w:w="2280"/>
+          </w:tcPr>
+          <w:p>
+            <w:pPr>
+              <w:spacing w:before="40" w:after="40"/>
+            </w:pPr>
+            <w:r/>
+            <w:r>
+              <w:t>1,730</w:t>
+            </w:r>
+          </w:p>
+        </w:tc>
+        <w:tc>
+          <w:tcPr>
+            <w:tcW w:type="dxa" w:w="2280"/>
+          </w:tcPr>
+          <w:p>
+            <w:pPr>
+              <w:spacing w:before="40" w:after="40"/>
+            </w:pPr>
+            <w:r/>
+            <w:r>
+              <w:t>0.05%</w:t>
+            </w:r>
+          </w:p>
+        </w:tc>
+      </w:tr>
+    </w:tbl>
+    <w:p/>
+    <w:p>
+      <w:pPr>
+        <w:spacing w:after="120"/>
+      </w:pPr>
+      <w:r>
+        <w:t xml:space="preserve">After filtering, train pairs are randomly shuffled and capped at </w:t>
+      </w:r>
+      <w:r>
+        <w:rPr>
+          <w:rFonts w:ascii="Courier New" w:hAnsi="Courier New"/>
+          <w:sz w:val="20"/>
+        </w:rPr>
+        <w:t>max_train_pairs=1,500,000</w:t>
+      </w:r>
+      <w:r>
+        <w:t xml:space="preserve">. A sample of 200 pairs is written to </w:t>
+      </w:r>
+      <w:r>
+        <w:rPr>
+          <w:rFonts w:ascii="Courier New" w:hAnsi="Courier New"/>
+          <w:sz w:val="20"/>
+        </w:rPr>
+        <w:t>stage4_train_samples.txt</w:t>
+      </w:r>
+      <w:r>
+        <w:t xml:space="preserve"> for manual inspection.</w:t>
+      </w:r>
+    </w:p>
+    <w:p>
+      <w:pPr>
+        <w:jc w:val="center"/>
+      </w:pPr>
+      <w:r>
+        <w:drawing>
+          <wp:inline xmlns:a="http://schemas.openxmlformats.org/drawingml/2006/main" xmlns:pic="http://schemas.openxmlformats.org/drawingml/2006/picture">
+            <wp:extent cx="5029200" cy="3052568"/>
+            <wp:docPr id="4" name="Picture 4"/>
+            <wp:cNvGraphicFramePr>
+              <a:graphicFrameLocks noChangeAspect="1"/>
+            </wp:cNvGraphicFramePr>
+            <a:graphic>
+              <a:graphicData uri="http://schemas.openxmlformats.org/drawingml/2006/picture">
+                <pic:pic>
+                  <pic:nvPicPr>
+                    <pic:cNvPr id="0" name="fig_p3_stage4_filters.png"/>
+                    <pic:cNvPicPr/>
+                  </pic:nvPicPr>
+                  <pic:blipFill>
+                    <a:blip r:embed="rId12"/>
+                    <a:stretch>
+                      <a:fillRect/>
+                    </a:stretch>
+                  </pic:blipFill>
+                  <pic:spPr>
+                    <a:xfrm>
+                      <a:off x="0" y="0"/>
+                      <a:ext cx="5029200" cy="3052568"/>
+                    </a:xfrm>
+                    <a:prstGeom prst="rect"/>
+                  </pic:spPr>
+                </pic:pic>
+              </a:graphicData>
+            </a:graphic>
+          </wp:inline>
+        </w:drawing>
+      </w:r>
+    </w:p>
+    <w:p>
+      <w:pPr>
+        <w:spacing w:before="40" w:after="200"/>
+        <w:jc w:val="center"/>
+      </w:pPr>
+      <w:r>
+        <w:rPr>
+          <w:i/>
+          <w:sz w:val="18"/>
+        </w:rPr>
+        <w:t>Figure P3 — Stage 4 pair filter breakdown by filter type</w:t>
+      </w:r>
+    </w:p>
+    <w:p>
+      <w:pPr>
+        <w:spacing w:after="120"/>
+      </w:pPr>
+      <w:r>
+        <w:t>*Figure P3: Response-too-short (48.0%) and incoherent-pair (37.0%) filters account for 85% of all pair discards, reflecting the noisy nature of raw IRC dialogue. All other filters are minor by comparison.*</w:t>
+      </w:r>
+    </w:p>
+    <w:p>
+      <w:pPr>
+        <w:pBdr>
+          <w:bottom w:val="single" w:sz="6" w:space="1" w:color="AAAAAA"/>
+        </w:pBdr>
+      </w:pPr>
+    </w:p>
+    <w:p>
+      <w:pPr>
+        <w:pStyle w:val="Heading3"/>
+        <w:spacing w:before="200"/>
+      </w:pPr>
+      <w:r>
+        <w:t>A.5 Stage 4.5 — Domain Filter</w:t>
+      </w:r>
+    </w:p>
+    <w:p>
+      <w:pPr>
+        <w:spacing w:after="120"/>
+      </w:pPr>
+      <w:r/>
+      <w:r>
+        <w:rPr>
+          <w:b/>
+        </w:rPr>
+        <w:t>Function:</w:t>
+      </w:r>
+      <w:r>
+        <w:t xml:space="preserve"> </w:t>
+      </w:r>
+      <w:r>
+        <w:rPr>
+          <w:rFonts w:ascii="Courier New" w:hAnsi="Courier New"/>
+          <w:sz w:val="20"/>
+        </w:rPr>
+        <w:t>stage4_5_domain_filter(train_pairs, val_pairs, test_pairs, cfg)</w:t>
+      </w:r>
+      <w:r/>
+    </w:p>
+    <w:p>
+      <w:pPr>
+        <w:spacing w:after="120"/>
+      </w:pPr>
+      <w:r/>
+      <w:r>
+        <w:rPr>
+          <w:b/>
+        </w:rPr>
+        <w:t>Config:</w:t>
+      </w:r>
+      <w:r>
+        <w:t xml:space="preserve"> </w:t>
+      </w:r>
+      <w:r>
+        <w:rPr>
+          <w:rFonts w:ascii="Courier New" w:hAnsi="Courier New"/>
+          <w:sz w:val="20"/>
+        </w:rPr>
+        <w:t>domain_filter=True</w:t>
+      </w:r>
+      <w:r>
+        <w:t xml:space="preserve">, </w:t>
+      </w:r>
+      <w:r>
+        <w:rPr>
+          <w:rFonts w:ascii="Courier New" w:hAnsi="Courier New"/>
+          <w:sz w:val="20"/>
+        </w:rPr>
+        <w:t>domain_filter_strategy="union"</w:t>
+      </w:r>
+      <w:r/>
+    </w:p>
+    <w:p>
+      <w:pPr>
+        <w:spacing w:after="120"/>
+      </w:pPr>
+      <w:r/>
+      <w:r>
+        <w:rPr>
+          <w:b/>
+        </w:rPr>
+        <w:t>Output:</w:t>
+      </w:r>
+      <w:r>
+        <w:t xml:space="preserve"> </w:t>
+      </w:r>
+      <w:r>
+        <w:rPr>
+          <w:rFonts w:ascii="Courier New" w:hAnsi="Courier New"/>
+          <w:sz w:val="20"/>
+        </w:rPr>
+        <w:t>stage4_5_*_pairs.json</w:t>
+      </w:r>
+      <w:r>
+        <w:t xml:space="preserve">, </w:t>
+      </w:r>
+      <w:r>
+        <w:rPr>
+          <w:rFonts w:ascii="Courier New" w:hAnsi="Courier New"/>
+          <w:sz w:val="20"/>
+        </w:rPr>
+        <w:t>stage4_5_filter_stats.json</w:t>
+      </w:r>
+      <w:r/>
+    </w:p>
+    <w:p>
+      <w:pPr>
+        <w:spacing w:after="120"/>
+      </w:pPr>
+      <w:r>
+        <w:t xml:space="preserve">Retains pairs matching </w:t>
+      </w:r>
+      <w:r>
+        <w:rPr>
+          <w:b/>
+        </w:rPr>
+        <w:t>Strategy A</w:t>
+      </w:r>
+      <w:r>
+        <w:t xml:space="preserve"> (command/path signal) OR </w:t>
+      </w:r>
+      <w:r>
+        <w:rPr>
+          <w:b/>
+        </w:rPr>
+        <w:t>Strategy B</w:t>
+      </w:r>
+      <w:r>
+        <w:t xml:space="preserve"> (question pattern). The union avoids the over-restrictive intersection (~300k) while still removing chit-chat noise.</w:t>
+      </w:r>
+    </w:p>
+    <w:p>
+      <w:pPr>
+        <w:pStyle w:val="Heading4"/>
+        <w:spacing w:before="200"/>
+      </w:pPr>
+      <w:r>
+        <w:t>Strategy A — Command filter (`_DOMAIN_CMD_RE`)</w:t>
+      </w:r>
+    </w:p>
+    <w:p>
+      <w:pPr>
+        <w:spacing w:before="80" w:after="80"/>
+        <w:ind w:left="432"/>
+        <w:shd w:val="clear" w:color="auto" w:fill="F2F2F2"/>
+      </w:pPr>
+      <w:r>
+        <w:rPr>
+          <w:rFonts w:ascii="Courier New" w:hAnsi="Courier New"/>
+          <w:sz w:val="18"/>
+        </w:rPr>
+        <w:t>\b(sudo|apt-get|apt|dpkg|snap|chmod|chown|grep|cat|ls|mkdir|rm|cp|mv|</w:t>
+        <w:br/>
+        <w:t xml:space="preserve">   wget|curl|tar|ssh|df|du|kill|mount|umount|pip|nano|vim|vi|sed|awk|</w:t>
+        <w:br/>
+        <w:t xml:space="preserve">   find|locate|ps|top|ping|service|systemctl|ufw|crontab|adduser|passwd|</w:t>
+        <w:br/>
+        <w:t xml:space="preserve">   netstat|ifconfig|export|echo|source|make|gcc)\b</w:t>
+      </w:r>
+    </w:p>
+    <w:p>
+      <w:pPr>
+        <w:spacing w:after="120"/>
+      </w:pPr>
+      <w:r>
+        <w:t xml:space="preserve">OR </w:t>
+      </w:r>
+      <w:r>
+        <w:rPr>
+          <w:rFonts w:ascii="Courier New" w:hAnsi="Courier New"/>
+          <w:sz w:val="20"/>
+        </w:rPr>
+        <w:t>"__path__"</w:t>
+      </w:r>
+      <w:r>
+        <w:t xml:space="preserve"> present in ctx or resp (already-masked filesystem references).</w:t>
+      </w:r>
+    </w:p>
+    <w:p>
+      <w:pPr>
+        <w:spacing w:after="120"/>
+      </w:pPr>
+      <w:r>
+        <w:t xml:space="preserve">&gt; </w:t>
+      </w:r>
+      <w:r>
+        <w:rPr>
+          <w:b/>
+        </w:rPr>
+        <w:t>Critical design note:</w:t>
+      </w:r>
+      <w:r>
+        <w:t xml:space="preserve"> </w:t>
+      </w:r>
+      <w:r>
+        <w:rPr>
+          <w:rFonts w:ascii="Courier New" w:hAnsi="Courier New"/>
+          <w:sz w:val="20"/>
+        </w:rPr>
+        <w:t>?</w:t>
+      </w:r>
+      <w:r>
+        <w:t xml:space="preserve"> is stripped by </w:t>
+      </w:r>
+      <w:r>
+        <w:rPr>
+          <w:rFonts w:ascii="Courier New" w:hAnsi="Courier New"/>
+          <w:sz w:val="20"/>
+        </w:rPr>
+        <w:t>_RE_NONALPHA</w:t>
+      </w:r>
+      <w:r>
+        <w:t xml:space="preserve"> in Stage 2. All question-pattern matching must therefore be punctuation-free. Commands are NOT replaced by </w:t>
+      </w:r>
+      <w:r>
+        <w:rPr>
+          <w:rFonts w:ascii="Courier New" w:hAnsi="Courier New"/>
+          <w:sz w:val="20"/>
+        </w:rPr>
+        <w:t>__cmd__</w:t>
+      </w:r>
+      <w:r>
+        <w:t xml:space="preserve"> (the token is reserved but never substituted) — they survive </w:t>
+      </w:r>
+      <w:r>
+        <w:rPr>
+          <w:rFonts w:ascii="Courier New" w:hAnsi="Courier New"/>
+          <w:sz w:val="20"/>
+        </w:rPr>
+        <w:t>_clean_text</w:t>
+      </w:r>
+      <w:r>
+        <w:t xml:space="preserve"> intact.</w:t>
+      </w:r>
+    </w:p>
+    <w:p>
+      <w:pPr>
+        <w:pStyle w:val="Heading4"/>
+        <w:spacing w:before="200"/>
+      </w:pPr>
+      <w:r>
+        <w:t>Strategy B — Question filter (`_DOMAIN_Q_PATTERNS`, last substantive context turn)</w:t>
+      </w:r>
+    </w:p>
+    <w:p>
+      <w:pPr>
+        <w:spacing w:before="80" w:after="80"/>
+        <w:ind w:left="432"/>
+        <w:shd w:val="clear" w:color="auto" w:fill="F2F2F2"/>
+      </w:pPr>
+      <w:r>
+        <w:rPr>
+          <w:rFonts w:ascii="Courier New" w:hAnsi="Courier New"/>
+          <w:sz w:val="18"/>
+        </w:rPr>
+        <w:t>how (do|can|to) (i|you|we)    what (is|are|does|do)</w:t>
+        <w:br/>
+        <w:t>where (is|are|can|do)          why (is|does|do)</w:t>
+        <w:br/>
+        <w:t>cannot                         problem|error|fail|broken|issue|not working</w:t>
+        <w:br/>
+        <w:t>i (need|want|am trying) to     anyone|anybody know</w:t>
+        <w:br/>
+        <w:t>is (is|can|do|will|does)\b</w:t>
+      </w:r>
+    </w:p>
+    <w:p>
+      <w:pPr>
+        <w:spacing w:after="120"/>
+      </w:pPr>
+      <w:r>
+        <w:t xml:space="preserve">Only the </w:t>
+      </w:r>
+      <w:r>
+        <w:rPr>
+          <w:b/>
+        </w:rPr>
+        <w:t>last 1–2 substantive turns</w:t>
+      </w:r>
+      <w:r>
+        <w:t xml:space="preserve"> (≥ 4 words) of the context are scanned — scanning all turns would match questions asked several exchanges ago, pairing them with off-topic recent replies.</w:t>
+      </w:r>
+    </w:p>
+    <w:p>
+      <w:pPr>
+        <w:pStyle w:val="Heading4"/>
+        <w:spacing w:before="200"/>
+      </w:pPr>
+      <w:r>
+        <w:t>Results</w:t>
+      </w:r>
+    </w:p>
+    <w:tbl>
+      <w:tblPr>
+        <w:tblStyle w:val="TableGrid"/>
+        <w:tblW w:type="auto" w:w="0"/>
+        <w:tblLook w:firstColumn="1" w:firstRow="1" w:lastColumn="0" w:lastRow="0" w:noHBand="0" w:noVBand="1" w:val="04A0"/>
+      </w:tblPr>
+      <w:tblGrid>
+        <w:gridCol w:w="2280"/>
+        <w:gridCol w:w="2280"/>
+        <w:gridCol w:w="2280"/>
+        <w:gridCol w:w="2280"/>
+      </w:tblGrid>
+      <w:tr>
+        <w:tc>
+          <w:tcPr>
+            <w:tcW w:type="dxa" w:w="2280"/>
+          </w:tcPr>
+          <w:p>
+            <w:pPr>
+              <w:spacing w:before="40" w:after="40"/>
+            </w:pPr>
+            <w:r/>
+            <w:r>
+              <w:rPr>
+                <w:b/>
+              </w:rPr>
               <w:t>Split</w:t>
             </w:r>
           </w:p>
@@ -3870,6 +4346,66 @@
       </w:tr>
     </w:tbl>
     <w:p/>
+    <w:p>
+      <w:pPr>
+        <w:jc w:val="center"/>
+      </w:pPr>
+      <w:r>
+        <w:drawing>
+          <wp:inline xmlns:a="http://schemas.openxmlformats.org/drawingml/2006/main" xmlns:pic="http://schemas.openxmlformats.org/drawingml/2006/picture">
+            <wp:extent cx="5029200" cy="2084460"/>
+            <wp:docPr id="5" name="Picture 5"/>
+            <wp:cNvGraphicFramePr>
+              <a:graphicFrameLocks noChangeAspect="1"/>
+            </wp:cNvGraphicFramePr>
+            <a:graphic>
+              <a:graphicData uri="http://schemas.openxmlformats.org/drawingml/2006/picture">
+                <pic:pic>
+                  <pic:nvPicPr>
+                    <pic:cNvPr id="0" name="fig_p4_domain_filter.png"/>
+                    <pic:cNvPicPr/>
+                  </pic:nvPicPr>
+                  <pic:blipFill>
+                    <a:blip r:embed="rId13"/>
+                    <a:stretch>
+                      <a:fillRect/>
+                    </a:stretch>
+                  </pic:blipFill>
+                  <pic:spPr>
+                    <a:xfrm>
+                      <a:off x="0" y="0"/>
+                      <a:ext cx="5029200" cy="2084460"/>
+                    </a:xfrm>
+                    <a:prstGeom prst="rect"/>
+                  </pic:spPr>
+                </pic:pic>
+              </a:graphicData>
+            </a:graphic>
+          </wp:inline>
+        </w:drawing>
+      </w:r>
+    </w:p>
+    <w:p>
+      <w:pPr>
+        <w:spacing w:before="40" w:after="200"/>
+        <w:jc w:val="center"/>
+      </w:pPr>
+      <w:r>
+        <w:rPr>
+          <w:i/>
+          <w:sz w:val="18"/>
+        </w:rPr>
+        <w:t>Figure P4 — Stage 4.5 domain filter outcome and signal overlap</w:t>
+      </w:r>
+    </w:p>
+    <w:p>
+      <w:pPr>
+        <w:spacing w:after="120"/>
+      </w:pPr>
+      <w:r>
+        <w:t>*Figure P4: Left — stacked bar showing the composition of kept pairs (command-only, both signals, question-only) vs filtered-out pairs. Right — donut chart showing the proportion of each signal category across all 1.5M input pairs. The union strategy retains 73.6% while requiring at least one domain signal.*</w:t>
+      </w:r>
+    </w:p>
     <w:p>
       <w:pPr>
         <w:pBdr>
@@ -5505,88 +6041,408 @@
     </w:p>
     <w:p>
       <w:pPr>
-        <w:spacing w:before="80" w:after="80"/>
-        <w:ind w:left="432"/>
-        <w:shd w:val="clear" w:color="auto" w:fill="F2F2F2"/>
+        <w:spacing w:after="120"/>
       </w:pPr>
       <w:r>
-        <w:rPr>
-          <w:rFonts w:ascii="Courier New" w:hAnsi="Courier New"/>
-          <w:sz w:val="18"/>
-        </w:rPr>
-        <w:t xml:space="preserve">                  RAW CORPUS</w:t>
-        <w:br/>
-        <w:t xml:space="preserve">                  1,852,868 dialogues</w:t>
-        <w:br/>
-        <w:t xml:space="preserve">                       │</w:t>
-        <w:br/>
-        <w:t xml:space="preserve">            ┌──────────┴──────────┐</w:t>
-        <w:br/>
-        <w:t xml:space="preserve">            │    Stage 2 filters  │  −537,760  (29.0%)</w:t>
-        <w:br/>
-        <w:t xml:space="preserve">            │  • speaker dominance│  234,864</w:t>
-        <w:br/>
-        <w:t xml:space="preserve">            │  • temporal gap     │  175,962</w:t>
-        <w:br/>
-        <w:t xml:space="preserve">            │  • low alternation  │   82,045</w:t>
-        <w:br/>
-        <w:t xml:space="preserve">            │  • bot turns / paste│   (turn-level, not tracked at dlg level)</w:t>
-        <w:br/>
-        <w:t xml:space="preserve">            └──────────┬──────────┘</w:t>
-        <w:br/>
-        <w:t xml:space="preserve">                  1,315,108 dialogues</w:t>
-        <w:br/>
-        <w:t xml:space="preserve">                       │</w:t>
-        <w:br/>
-        <w:t xml:space="preserve">            ┌──────────┴──────────┐</w:t>
-        <w:br/>
-        <w:t xml:space="preserve">            │    Stage 3 split    │  no discard — assignment only</w:t>
-        <w:br/>
-        <w:t xml:space="preserve">            │  train  95.8%       │</w:t>
-        <w:br/>
-        <w:t xml:space="preserve">            │  val     2.1%       │</w:t>
-        <w:br/>
-        <w:t xml:space="preserve">            │  test    2.1%       │</w:t>
-        <w:br/>
-        <w:t xml:space="preserve">            └──────────┬──────────┘</w:t>
-        <w:br/>
-        <w:t xml:space="preserve">                  1,315,108 dialogues → pair generation</w:t>
-        <w:br/>
-        <w:t xml:space="preserve">                       │</w:t>
-        <w:br/>
-        <w:t xml:space="preserve">            ┌──────────┴──────────┐</w:t>
-        <w:br/>
-        <w:t xml:space="preserve">            │   Stage 4 filters   │</w:t>
-        <w:br/>
-        <w:t xml:space="preserve">            │  • resp too short   │  −971,906  (27.6% of raw pairs)</w:t>
-        <w:br/>
-        <w:t xml:space="preserve">            │  • incoherent pair  │  −748,826  (21.2%)</w:t>
-        <w:br/>
-        <w:t xml:space="preserve">            │  • resp too long    │  −255,579   (7.3%)</w:t>
-        <w:br/>
-        <w:t xml:space="preserve">            │  • diversity cap    │   −1,730   (0.05%)</w:t>
-        <w:br/>
-        <w:t xml:space="preserve">            │  • cap at 1.5M      │  (random truncation after shuffle)</w:t>
-        <w:br/>
-        <w:t xml:space="preserve">            └──────────┬──────────┘</w:t>
-        <w:br/>
-        <w:t xml:space="preserve">                  1,500,000 pairs (train) + 126,080 (val+test)</w:t>
-        <w:br/>
-        <w:t xml:space="preserve">                       │</w:t>
-        <w:br/>
-        <w:t xml:space="preserve">            ┌──────────┴──────────┐</w:t>
-        <w:br/>
-        <w:t xml:space="preserve">            │  Stage 4.5 domain   │  −396,461 train  (26.4%)</w:t>
-        <w:br/>
-        <w:t xml:space="preserve">            │  filter (union)     │  −28,657  val+test</w:t>
-        <w:br/>
-        <w:t xml:space="preserve">            └──────────┬──────────┘</w:t>
-        <w:br/>
-        <w:t xml:space="preserve">                  1,103,539 train / 47,244 val / 47,377 test</w:t>
-        <w:br/>
-        <w:t xml:space="preserve">                  ════════════════════════════════════════</w:t>
-        <w:br/>
-        <w:t xml:space="preserve">                       FINAL DATASET (GPU-ready JSONL)</w:t>
+        <w:t>The complete data reduction path is shown in Figure P1 (see Overview section). The step-by-step discard counts are summarised below for reference:</w:t>
+      </w:r>
+    </w:p>
+    <w:tbl>
+      <w:tblPr>
+        <w:tblStyle w:val="TableGrid"/>
+        <w:tblW w:type="auto" w:w="0"/>
+        <w:tblLook w:firstColumn="1" w:firstRow="1" w:lastColumn="0" w:lastRow="0" w:noHBand="0" w:noVBand="1" w:val="04A0"/>
+      </w:tblPr>
+      <w:tblGrid>
+        <w:gridCol w:w="1824"/>
+        <w:gridCol w:w="1824"/>
+        <w:gridCol w:w="1824"/>
+        <w:gridCol w:w="1824"/>
+        <w:gridCol w:w="1824"/>
+      </w:tblGrid>
+      <w:tr>
+        <w:tc>
+          <w:tcPr>
+            <w:tcW w:type="dxa" w:w="1824"/>
+          </w:tcPr>
+          <w:p>
+            <w:pPr>
+              <w:spacing w:before="40" w:after="40"/>
+            </w:pPr>
+            <w:r/>
+            <w:r>
+              <w:rPr>
+                <w:b/>
+              </w:rPr>
+              <w:t>Stage</w:t>
+            </w:r>
+          </w:p>
+        </w:tc>
+        <w:tc>
+          <w:tcPr>
+            <w:tcW w:type="dxa" w:w="1824"/>
+          </w:tcPr>
+          <w:p>
+            <w:pPr>
+              <w:spacing w:before="40" w:after="40"/>
+            </w:pPr>
+            <w:r/>
+            <w:r>
+              <w:rPr>
+                <w:b/>
+              </w:rPr>
+              <w:t>Records in</w:t>
+            </w:r>
+          </w:p>
+        </w:tc>
+        <w:tc>
+          <w:tcPr>
+            <w:tcW w:type="dxa" w:w="1824"/>
+          </w:tcPr>
+          <w:p>
+            <w:pPr>
+              <w:spacing w:before="40" w:after="40"/>
+            </w:pPr>
+            <w:r/>
+            <w:r>
+              <w:rPr>
+                <w:b/>
+              </w:rPr>
+              <w:t>Records out</w:t>
+            </w:r>
+          </w:p>
+        </w:tc>
+        <w:tc>
+          <w:tcPr>
+            <w:tcW w:type="dxa" w:w="1824"/>
+          </w:tcPr>
+          <w:p>
+            <w:pPr>
+              <w:spacing w:before="40" w:after="40"/>
+            </w:pPr>
+            <w:r/>
+            <w:r>
+              <w:rPr>
+                <w:b/>
+              </w:rPr>
+              <w:t>Discarded</w:t>
+            </w:r>
+          </w:p>
+        </w:tc>
+        <w:tc>
+          <w:tcPr>
+            <w:tcW w:type="dxa" w:w="1824"/>
+          </w:tcPr>
+          <w:p>
+            <w:pPr>
+              <w:spacing w:before="40" w:after="40"/>
+            </w:pPr>
+            <w:r/>
+            <w:r>
+              <w:rPr>
+                <w:b/>
+              </w:rPr>
+              <w:t>% kept</w:t>
+            </w:r>
+          </w:p>
+        </w:tc>
+      </w:tr>
+      <w:tr>
+        <w:tc>
+          <w:tcPr>
+            <w:tcW w:type="dxa" w:w="1824"/>
+          </w:tcPr>
+          <w:p>
+            <w:pPr>
+              <w:spacing w:before="40" w:after="40"/>
+            </w:pPr>
+            <w:r/>
+            <w:r>
+              <w:t>Stage 2 — Clean &amp; Filter</w:t>
+            </w:r>
+          </w:p>
+        </w:tc>
+        <w:tc>
+          <w:tcPr>
+            <w:tcW w:type="dxa" w:w="1824"/>
+          </w:tcPr>
+          <w:p>
+            <w:pPr>
+              <w:spacing w:before="40" w:after="40"/>
+            </w:pPr>
+            <w:r/>
+            <w:r>
+              <w:t>1,852,868 dlg</w:t>
+            </w:r>
+          </w:p>
+        </w:tc>
+        <w:tc>
+          <w:tcPr>
+            <w:tcW w:type="dxa" w:w="1824"/>
+          </w:tcPr>
+          <w:p>
+            <w:pPr>
+              <w:spacing w:before="40" w:after="40"/>
+            </w:pPr>
+            <w:r/>
+            <w:r>
+              <w:t>1,315,108 dlg</w:t>
+            </w:r>
+          </w:p>
+        </w:tc>
+        <w:tc>
+          <w:tcPr>
+            <w:tcW w:type="dxa" w:w="1824"/>
+          </w:tcPr>
+          <w:p>
+            <w:pPr>
+              <w:spacing w:before="40" w:after="40"/>
+            </w:pPr>
+            <w:r/>
+            <w:r>
+              <w:t>537,760</w:t>
+            </w:r>
+          </w:p>
+        </w:tc>
+        <w:tc>
+          <w:tcPr>
+            <w:tcW w:type="dxa" w:w="1824"/>
+          </w:tcPr>
+          <w:p>
+            <w:pPr>
+              <w:spacing w:before="40" w:after="40"/>
+            </w:pPr>
+            <w:r/>
+            <w:r>
+              <w:t>71.0%</w:t>
+            </w:r>
+          </w:p>
+        </w:tc>
+      </w:tr>
+      <w:tr>
+        <w:tc>
+          <w:tcPr>
+            <w:tcW w:type="dxa" w:w="1824"/>
+          </w:tcPr>
+          <w:p>
+            <w:pPr>
+              <w:spacing w:before="40" w:after="40"/>
+            </w:pPr>
+            <w:r/>
+            <w:r>
+              <w:t>Stage 3 — Split (train only)</w:t>
+            </w:r>
+          </w:p>
+        </w:tc>
+        <w:tc>
+          <w:tcPr>
+            <w:tcW w:type="dxa" w:w="1824"/>
+          </w:tcPr>
+          <w:p>
+            <w:pPr>
+              <w:spacing w:before="40" w:after="40"/>
+            </w:pPr>
+            <w:r/>
+            <w:r>
+              <w:t>1,315,108 dlg</w:t>
+            </w:r>
+          </w:p>
+        </w:tc>
+        <w:tc>
+          <w:tcPr>
+            <w:tcW w:type="dxa" w:w="1824"/>
+          </w:tcPr>
+          <w:p>
+            <w:pPr>
+              <w:spacing w:before="40" w:after="40"/>
+            </w:pPr>
+            <w:r/>
+            <w:r>
+              <w:t>1,259,711 dlg</w:t>
+            </w:r>
+          </w:p>
+        </w:tc>
+        <w:tc>
+          <w:tcPr>
+            <w:tcW w:type="dxa" w:w="1824"/>
+          </w:tcPr>
+          <w:p>
+            <w:pPr>
+              <w:spacing w:before="40" w:after="40"/>
+            </w:pPr>
+            <w:r/>
+            <w:r>
+              <w:t>55,397 (val+test)</w:t>
+            </w:r>
+          </w:p>
+        </w:tc>
+        <w:tc>
+          <w:tcPr>
+            <w:tcW w:type="dxa" w:w="1824"/>
+          </w:tcPr>
+          <w:p>
+            <w:pPr>
+              <w:spacing w:before="40" w:after="40"/>
+            </w:pPr>
+            <w:r/>
+            <w:r>
+              <w:t>95.8% of train</w:t>
+            </w:r>
+          </w:p>
+        </w:tc>
+      </w:tr>
+      <w:tr>
+        <w:tc>
+          <w:tcPr>
+            <w:tcW w:type="dxa" w:w="1824"/>
+          </w:tcPr>
+          <w:p>
+            <w:pPr>
+              <w:spacing w:before="40" w:after="40"/>
+            </w:pPr>
+            <w:r/>
+            <w:r>
+              <w:t>Stage 4 — Pair filters</w:t>
+            </w:r>
+          </w:p>
+        </w:tc>
+        <w:tc>
+          <w:tcPr>
+            <w:tcW w:type="dxa" w:w="1824"/>
+          </w:tcPr>
+          <w:p>
+            <w:pPr>
+              <w:spacing w:before="40" w:after="40"/>
+            </w:pPr>
+            <w:r/>
+            <w:r>
+              <w:t>~3.5M raw pairs</w:t>
+            </w:r>
+          </w:p>
+        </w:tc>
+        <w:tc>
+          <w:tcPr>
+            <w:tcW w:type="dxa" w:w="1824"/>
+          </w:tcPr>
+          <w:p>
+            <w:pPr>
+              <w:spacing w:before="40" w:after="40"/>
+            </w:pPr>
+            <w:r/>
+            <w:r>
+              <w:t>1,500,000 pairs</w:t>
+            </w:r>
+          </w:p>
+        </w:tc>
+        <w:tc>
+          <w:tcPr>
+            <w:tcW w:type="dxa" w:w="1824"/>
+          </w:tcPr>
+          <w:p>
+            <w:pPr>
+              <w:spacing w:before="40" w:after="40"/>
+            </w:pPr>
+            <w:r/>
+            <w:r>
+              <w:t>~2,024,293</w:t>
+            </w:r>
+          </w:p>
+        </w:tc>
+        <w:tc>
+          <w:tcPr>
+            <w:tcW w:type="dxa" w:w="1824"/>
+          </w:tcPr>
+          <w:p>
+            <w:pPr>
+              <w:spacing w:before="40" w:after="40"/>
+            </w:pPr>
+            <w:r/>
+            <w:r>
+              <w:t>—</w:t>
+            </w:r>
+          </w:p>
+        </w:tc>
+      </w:tr>
+      <w:tr>
+        <w:tc>
+          <w:tcPr>
+            <w:tcW w:type="dxa" w:w="1824"/>
+          </w:tcPr>
+          <w:p>
+            <w:pPr>
+              <w:spacing w:before="40" w:after="40"/>
+            </w:pPr>
+            <w:r/>
+            <w:r>
+              <w:t>Stage 4.5 — Domain filter</w:t>
+            </w:r>
+          </w:p>
+        </w:tc>
+        <w:tc>
+          <w:tcPr>
+            <w:tcW w:type="dxa" w:w="1824"/>
+          </w:tcPr>
+          <w:p>
+            <w:pPr>
+              <w:spacing w:before="40" w:after="40"/>
+            </w:pPr>
+            <w:r/>
+            <w:r>
+              <w:t>1,500,000 pairs</w:t>
+            </w:r>
+          </w:p>
+        </w:tc>
+        <w:tc>
+          <w:tcPr>
+            <w:tcW w:type="dxa" w:w="1824"/>
+          </w:tcPr>
+          <w:p>
+            <w:pPr>
+              <w:spacing w:before="40" w:after="40"/>
+            </w:pPr>
+            <w:r/>
+            <w:r>
+              <w:t>1,103,539 pairs</w:t>
+            </w:r>
+          </w:p>
+        </w:tc>
+        <w:tc>
+          <w:tcPr>
+            <w:tcW w:type="dxa" w:w="1824"/>
+          </w:tcPr>
+          <w:p>
+            <w:pPr>
+              <w:spacing w:before="40" w:after="40"/>
+            </w:pPr>
+            <w:r/>
+            <w:r>
+              <w:t>396,461</w:t>
+            </w:r>
+          </w:p>
+        </w:tc>
+        <w:tc>
+          <w:tcPr>
+            <w:tcW w:type="dxa" w:w="1824"/>
+          </w:tcPr>
+          <w:p>
+            <w:pPr>
+              <w:spacing w:before="40" w:after="40"/>
+            </w:pPr>
+            <w:r/>
+            <w:r>
+              <w:t>73.6%</w:t>
+            </w:r>
+          </w:p>
+        </w:tc>
+      </w:tr>
+    </w:tbl>
+    <w:p/>
+    <w:p>
+      <w:pPr>
+        <w:spacing w:after="120"/>
+      </w:pPr>
+      <w:r>
+        <w:t>Stage 2 filter detail → Figure P2. Stage 4 filter detail → Figure P3. Stage 4.5 signal breakdown → Figure P4.</w:t>
       </w:r>
     </w:p>
     <w:p>
@@ -11715,6 +12571,66 @@
       </w:tr>
     </w:tbl>
     <w:p/>
+    <w:p>
+      <w:pPr>
+        <w:jc w:val="center"/>
+      </w:pPr>
+      <w:r>
+        <w:drawing>
+          <wp:inline xmlns:a="http://schemas.openxmlformats.org/drawingml/2006/main" xmlns:pic="http://schemas.openxmlformats.org/drawingml/2006/picture">
+            <wp:extent cx="5029200" cy="1934524"/>
+            <wp:docPr id="6" name="Picture 6"/>
+            <wp:cNvGraphicFramePr>
+              <a:graphicFrameLocks noChangeAspect="1"/>
+            </wp:cNvGraphicFramePr>
+            <a:graphic>
+              <a:graphicData uri="http://schemas.openxmlformats.org/drawingml/2006/picture">
+                <pic:pic>
+                  <pic:nvPicPr>
+                    <pic:cNvPr id="0" name="fig_p5_token_lengths.png"/>
+                    <pic:cNvPicPr/>
+                  </pic:nvPicPr>
+                  <pic:blipFill>
+                    <a:blip r:embed="rId14"/>
+                    <a:stretch>
+                      <a:fillRect/>
+                    </a:stretch>
+                  </pic:blipFill>
+                  <pic:spPr>
+                    <a:xfrm>
+                      <a:off x="0" y="0"/>
+                      <a:ext cx="5029200" cy="1934524"/>
+                    </a:xfrm>
+                    <a:prstGeom prst="rect"/>
+                  </pic:spPr>
+                </pic:pic>
+              </a:graphicData>
+            </a:graphic>
+          </wp:inline>
+        </w:drawing>
+      </w:r>
+    </w:p>
+    <w:p>
+      <w:pPr>
+        <w:spacing w:before="40" w:after="200"/>
+        <w:jc w:val="center"/>
+      </w:pPr>
+      <w:r>
+        <w:rPr>
+          <w:i/>
+          <w:sz w:val="18"/>
+        </w:rPr>
+        <w:t>Figure P5 — Stage 6 token length distributions for context and response sequences</w:t>
+      </w:r>
+    </w:p>
+    <w:p>
+      <w:pPr>
+        <w:spacing w:after="120"/>
+      </w:pPr>
+      <w:r>
+        <w:t>*Figure P5: Left — context length percentiles (train/val/test). The p95 value of 98 tokens confirms the 100-token cap is only active for the top ~5% of pairs. Right — response length percentiles. Only ~2.5% of responses reach the 40-token cap. The test split shows slightly longer sequences, consistent with the 2012 IRC period being more verbose.*</w:t>
+      </w:r>
+    </w:p>
     <w:p>
       <w:pPr>
         <w:spacing w:after="120"/>

</xml_diff>